<commit_message>
Add the degree to the title page; QIMS asks for it explicitly
Item (c) on the journal's title-page list is degree information, and it was
the only one of the nine missing. Written out in full rather than abbreviated,
because PhD and DHSc are both current renderings of a Doctor of Health
Sciences and picking one is the author's call, not mine.

Co-Authored-By: Claude Opus 5 <noreply@anthropic.com>
</commit_message>
<xml_diff>
--- a/paper/title_page.docx
+++ b/paper/title_page.docx
@@ -98,7 +98,7 @@
         <w:pStyle w:val="BodyText"/>
       </w:pPr>
       <w:r>
-        <w:t xml:space="preserve">Shuji Yamamoto</w:t>
+        <w:t xml:space="preserve">Shuji Yamamoto, Doctor of Health Sciences</w:t>
       </w:r>
     </w:p>
     <w:p>
@@ -141,7 +141,7 @@
         <w:pStyle w:val="BodyText"/>
       </w:pPr>
       <w:r>
-        <w:t xml:space="preserve">Shuji Yamamoto</w:t>
+        <w:t xml:space="preserve">Shuji Yamamoto, Doctor of Health Sciences</w:t>
       </w:r>
     </w:p>
     <w:p>

</xml_diff>